<commit_message>
Remove dash punctuation from monday CSM resume
Replace em dashes in the summary, job bullets, education, and
certifications with natural punctuation, and convert en-dash date
ranges to plain hyphens. Hyphenated words are preserved. Rebuilt
PDF and DOCX; still a balanced 2 pages.

Co-Authored-By: Claude Opus 4.8 <noreply@anthropic.com>
Claude-Session: https://claude.ai/code/session_01QaX3BGXdz82YqJsgLmNhmV
</commit_message>
<xml_diff>
--- a/applications/monday-customer-success-mid-market/resume.docx
+++ b/applications/monday-customer-success-mid-market/resume.docx
@@ -31,7 +31,7 @@
           <w:color w:val="555555"/>
           <w:sz w:val="23"/>
         </w:rPr>
-        <w:t>Technical Customer Success Manager — AI-Led Adoption, Implementation &amp; Account Growth</w:t>
+        <w:t>Technical Customer Success Manager: AI-Led Adoption, Implementation &amp; Account Growth</w:t>
       </w:r>
     </w:p>
     <w:p>
@@ -80,7 +80,7 @@
           <w:i w:val="0"/>
           <w:color w:val="1A1A1A"/>
         </w:rPr>
-        <w:t>Technical customer success and implementation professional with 15+ years across B2B SaaS, MarTech, and agency environments, owning the post-sale journey from onboarding through adoption, retention, and expansion. Pairs deep platform fluency and technical literacy — APIs, data flows, integrations, and CRM/workflow architecture — with a builder's command of generative AI, architecting autonomous, AI-driven systems that move customers from tool adoption to measurable business transformation. Trusted advisor to business owners and C-suite stakeholders; Denver-based founder of Solenzo who thrives in fast-paced, evolving technical environments.</w:t>
+        <w:t>Technical customer success and implementation professional with 15+ years across B2B SaaS, MarTech, and agency environments, owning the post-sale journey from onboarding through adoption, retention, and expansion. Pairs deep platform fluency and technical literacy across APIs, data flows, integrations, and CRM/workflow architecture with a builder's command of generative AI, architecting autonomous, AI-driven systems that move customers from tool adoption to measurable business transformation. Trusted advisor to business owners and C-suite stakeholders; Denver-based founder of Solenzo who thrives in fast-paced, evolving technical environments.</w:t>
       </w:r>
     </w:p>
     <w:p>
@@ -138,7 +138,7 @@
           <w:sz w:val="18"/>
         </w:rPr>
         <w:tab/>
-        <w:t>Feb 2024 – Present</w:t>
+        <w:t>Feb 2024 - Present</w:t>
       </w:r>
     </w:p>
     <w:p>
@@ -177,7 +177,7 @@
           <w:i w:val="0"/>
           <w:color w:val="1A1A1A"/>
         </w:rPr>
-        <w:t>Architect and deploy autonomous, AI-driven systems for B2B clients that automate manual workflows, generate insights, and scale internal operations — moving customers from tool adoption to measurable business transformation.</w:t>
+        <w:t>Architect and deploy autonomous, AI-driven systems for B2B clients that automate manual workflows, generate insights, and scale internal operations, moving customers from tool adoption to measurable business transformation.</w:t>
       </w:r>
     </w:p>
     <w:p>
@@ -249,7 +249,7 @@
           <w:i w:val="0"/>
           <w:color w:val="1A1A1A"/>
         </w:rPr>
-        <w:t>Architect and implement complex HubSpot CRM systems and integrations — segmentation, lifecycle stages, lead routing, and data-hygiene protocols — connecting tools and data across each client's tech stack.</w:t>
+        <w:t>Architect and implement complex HubSpot CRM systems and integrations spanning segmentation, lifecycle stages, lead routing, and data-hygiene protocols, connecting tools and data across each client's tech stack.</w:t>
       </w:r>
     </w:p>
     <w:p>
@@ -336,7 +336,7 @@
           <w:sz w:val="18"/>
         </w:rPr>
         <w:tab/>
-        <w:t>Sep 2024 – Feb 2025</w:t>
+        <w:t>Sep 2024 - Feb 2025</w:t>
       </w:r>
     </w:p>
     <w:p>
@@ -462,7 +462,7 @@
           <w:sz w:val="18"/>
         </w:rPr>
         <w:tab/>
-        <w:t>Feb 2023 – Apr 2024</w:t>
+        <w:t>Feb 2023 - Apr 2024</w:t>
       </w:r>
     </w:p>
     <w:p>
@@ -612,7 +612,7 @@
           <w:sz w:val="18"/>
         </w:rPr>
         <w:tab/>
-        <w:t>Aug 2020 – Aug 2022</w:t>
+        <w:t>Aug 2020 - Aug 2022</w:t>
       </w:r>
     </w:p>
     <w:p>
@@ -651,7 +651,7 @@
           <w:i w:val="0"/>
           <w:color w:val="1A1A1A"/>
         </w:rPr>
-        <w:t>Owned a high-value account portfolio across diverse verticals as the primary strategic contact, driving adoption and measurable growth — a 30% increase in website traffic and 25% improvement in conversion in the e-commerce segment.</w:t>
+        <w:t>Owned a high-value account portfolio across diverse verticals as the primary strategic contact, driving adoption and measurable growth, including a 30% increase in website traffic and a 25% improvement in conversion in the e-commerce segment.</w:t>
       </w:r>
     </w:p>
     <w:p>
@@ -738,7 +738,7 @@
           <w:sz w:val="18"/>
         </w:rPr>
         <w:tab/>
-        <w:t>Apr 2018 – Jul 2020</w:t>
+        <w:t>Apr 2018 - Jul 2020</w:t>
       </w:r>
     </w:p>
     <w:p>
@@ -888,7 +888,7 @@
           <w:sz w:val="18"/>
         </w:rPr>
         <w:tab/>
-        <w:t>Sep 2022 – Feb 2023</w:t>
+        <w:t>Sep 2022 - Feb 2023</w:t>
       </w:r>
     </w:p>
     <w:p>
@@ -990,7 +990,7 @@
           <w:sz w:val="18"/>
         </w:rPr>
         <w:tab/>
-        <w:t>2017 – 2018</w:t>
+        <w:t>2017 - 2018</w:t>
       </w:r>
     </w:p>
     <w:p>
@@ -1219,7 +1219,7 @@
           <w:i w:val="0"/>
           <w:color w:val="1A1A1A"/>
         </w:rPr>
-        <w:t>B.A. Liberal Arts, Minor in Political Science — Colorado State University, Fort Collins, CO</w:t>
+        <w:t>B.A. Liberal Arts, Minor in Political Science, Colorado State University, Fort Collins, CO</w:t>
       </w:r>
     </w:p>
     <w:p>
@@ -1252,7 +1252,7 @@
           <w:i w:val="0"/>
           <w:color w:val="1A1A1A"/>
         </w:rPr>
-        <w:t>Google Digital Marketing &amp; E-Commerce Professional Certificate — Google / Coursera (2024)</w:t>
+        <w:t>Google Digital Marketing &amp; E-Commerce Professional Certificate, Google / Coursera (2024)</w:t>
       </w:r>
     </w:p>
     <w:sectPr>

</xml_diff>